<commit_message>
feat: add resume experience editor and highlighter based on job requirements
</commit_message>
<xml_diff>
--- a/resumes/resume.docx
+++ b/resumes/resume.docx
@@ -156,28 +156,20 @@
         <w:rPr>
           <w:rStyle w:val="Strong"/>
           <w:rFonts w:eastAsia="Calibri" w:cs="Calibri" w:ascii="Calibri" w:hAnsi="Calibri"/>
-          <w:b w:val="0"/>
-          <w:color w:val="444444"/>
-          <w:sz w:val="20"/>
-          <w:szCs w:val="20"/>
-        </w:rPr>
-        <w:t xml:space="preserve">AI/ML Engineer with 3+ years of experience designing and deploying </w:t>
-      </w:r>
-      <w:r>
-        <w:rPr>
-          <w:rFonts w:eastAsia="Calibri" w:cs="Calibri" w:ascii="Calibri" w:hAnsi="Calibri"/>
-          <w:color w:val="444444"/>
-          <w:sz w:val="20"/>
-          <w:szCs w:val="20"/>
-        </w:rPr>
-      </w:r>
-      <w:r>
-        <w:rPr>
-          <w:rFonts w:ascii="Calibri" w:hAnsi="Calibri"/>
-          <w:b/>
-          <w:sz w:val="20"/>
-        </w:rPr>
-        <w:t>LLM-based solutions</w:t>
+          <w:b/>
+          <w:color w:val="444444"/>
+          <w:sz w:val="20"/>
+          <w:szCs w:val="20"/>
+        </w:rPr>
+        <w:t>AI/ML Engineer with 3+ years of experience</w:t>
+      </w:r>
+      <w:r>
+        <w:rPr>
+          <w:rFonts w:eastAsia="Calibri" w:cs="Calibri" w:ascii="Calibri" w:hAnsi="Calibri"/>
+          <w:color w:val="444444"/>
+          <w:sz w:val="20"/>
+          <w:szCs w:val="20"/>
+        </w:rPr>
       </w:r>
       <w:r>
         <w:rPr>
@@ -185,7 +177,7 @@
           <w:b w:val="0"/>
           <w:sz w:val="20"/>
         </w:rPr>
-        <w:t xml:space="preserve">, specializing in </w:t>
+        <w:t xml:space="preserve"> building and deploying production-grade Machine Learning, Generative AI, and Python-based solutions across the full ML lifecycle—from ETL and feature engineering to model training, LLM applications, multimodal RAG, MLOps, deployment, and monitoring. Skilled in Python, FastAPI, PostgreSQL (pgvector), LangChain, and cloud-ready AI systems. Currently completing an MBA in Artificial Intelligence &amp; Machine Learning, combining strong technical expertise with business strategy. </w:t>
       </w:r>
       <w:r>
         <w:rPr>
@@ -193,7 +185,7 @@
           <w:b/>
           <w:sz w:val="20"/>
         </w:rPr>
-        <w:t>RAG pipelines</w:t>
+        <w:t>Expert in RAG pipelines, embeddings, vector databases, and prompt engineering</w:t>
       </w:r>
       <w:r>
         <w:rPr>
@@ -201,7 +193,7 @@
           <w:b w:val="0"/>
           <w:sz w:val="20"/>
         </w:rPr>
-        <w:t xml:space="preserve">, </w:t>
+        <w:t xml:space="preserve">, with experience in AWS/Azure/GCP, Docker, CI/CD, and model evaluation. </w:t>
       </w:r>
       <w:r>
         <w:rPr>
@@ -209,7 +201,7 @@
           <w:b/>
           <w:sz w:val="20"/>
         </w:rPr>
-        <w:t>multimodal document processing</w:t>
+        <w:t>Proven track record in developing scalable AI components and automating experimentation workflows</w:t>
       </w:r>
       <w:r>
         <w:rPr>
@@ -217,103 +209,7 @@
           <w:b w:val="0"/>
           <w:sz w:val="20"/>
         </w:rPr>
-        <w:t xml:space="preserve">, and </w:t>
-      </w:r>
-      <w:r>
-        <w:rPr>
-          <w:rFonts w:ascii="Calibri" w:hAnsi="Calibri"/>
-          <w:b/>
-          <w:sz w:val="20"/>
-        </w:rPr>
-        <w:t>agentic AI systems</w:t>
-      </w:r>
-      <w:r>
-        <w:rPr>
-          <w:rFonts w:ascii="Calibri" w:hAnsi="Calibri"/>
-          <w:b w:val="0"/>
-          <w:sz w:val="20"/>
-        </w:rPr>
-        <w:t xml:space="preserve">. Skilled in </w:t>
-      </w:r>
-      <w:r>
-        <w:rPr>
-          <w:rFonts w:ascii="Calibri" w:hAnsi="Calibri"/>
-          <w:b/>
-          <w:sz w:val="20"/>
-        </w:rPr>
-        <w:t>Python, LangChain, Hugging Face</w:t>
-      </w:r>
-      <w:r>
-        <w:rPr>
-          <w:rFonts w:ascii="Calibri" w:hAnsi="Calibri"/>
-          <w:b w:val="0"/>
-          <w:sz w:val="20"/>
-        </w:rPr>
-        <w:t xml:space="preserve">, and vector databases like PostgreSQL (pgvector), with expertise in building </w:t>
-      </w:r>
-      <w:r>
-        <w:rPr>
-          <w:rFonts w:ascii="Calibri" w:hAnsi="Calibri"/>
-          <w:b/>
-          <w:sz w:val="20"/>
-        </w:rPr>
-        <w:t>hybrid retrieval systems</w:t>
-      </w:r>
-      <w:r>
-        <w:rPr>
-          <w:rFonts w:ascii="Calibri" w:hAnsi="Calibri"/>
-          <w:b w:val="0"/>
-          <w:sz w:val="20"/>
-        </w:rPr>
-        <w:t xml:space="preserve">, </w:t>
-      </w:r>
-      <w:r>
-        <w:rPr>
-          <w:rFonts w:ascii="Calibri" w:hAnsi="Calibri"/>
-          <w:b/>
-          <w:sz w:val="20"/>
-        </w:rPr>
-        <w:t>prompt engineering</w:t>
-      </w:r>
-      <w:r>
-        <w:rPr>
-          <w:rFonts w:ascii="Calibri" w:hAnsi="Calibri"/>
-          <w:b w:val="0"/>
-          <w:sz w:val="20"/>
-        </w:rPr>
-        <w:t xml:space="preserve">, and cloud deployment on AWS, Azure, and GCP. Proven track record in developing </w:t>
-      </w:r>
-      <w:r>
-        <w:rPr>
-          <w:rFonts w:ascii="Calibri" w:hAnsi="Calibri"/>
-          <w:b/>
-          <w:sz w:val="20"/>
-        </w:rPr>
-        <w:t>end-to-end RAG applications</w:t>
-      </w:r>
-      <w:r>
-        <w:rPr>
-          <w:rFonts w:ascii="Calibri" w:hAnsi="Calibri"/>
-          <w:b w:val="0"/>
-          <w:sz w:val="20"/>
-        </w:rPr>
-        <w:t xml:space="preserve"> for enterprise data, optimizing model performance through A/B testing and grounding accuracy, and integrating AI with business workflows. Currently pursuing an </w:t>
-      </w:r>
-      <w:r>
-        <w:rPr>
-          <w:rFonts w:ascii="Calibri" w:hAnsi="Calibri"/>
-          <w:b/>
-          <w:sz w:val="20"/>
-        </w:rPr>
-        <w:t>MBA in AI &amp; ML</w:t>
-      </w:r>
-      <w:r>
-        <w:rPr>
-          <w:rFonts w:ascii="Calibri" w:hAnsi="Calibri"/>
-          <w:b w:val="0"/>
-          <w:sz w:val="20"/>
-        </w:rPr>
-        <w:t xml:space="preserve"> to strengthen technical and strategic leadership capabilities.</w:t>
+        <w:t>.</w:t>
       </w:r>
     </w:p>
     <w:p>
@@ -365,7 +261,7 @@
           <w:b w:val="0"/>
           <w:color w:val="000000"/>
         </w:rPr>
-        <w:t>LLMs, RAG, LangChain, Hugging Face Transformers, Prompt Engineering, Fine-Tuning</w:t>
+        <w:t>LLMs, RAG, LangChain, LangGraph, Prompt Engineering</w:t>
       </w:r>
     </w:p>
     <w:p>
@@ -386,7 +282,7 @@
           <w:b w:val="0"/>
           <w:color w:val="000000"/>
         </w:rPr>
-        <w:t>Python, SQL, Apache Spark (PySpark), Pandas, NumPy, ETL/ELT Pipelines, PostgreSQL (pgvector), AWS SageMaker, GCP, Azure</w:t>
+        <w:t>Python, SQL, Apache Spark (PySpark), Pandas, NumPy, ETL/ELT Pipelines, PostgreSQL (pgvector), BigQuery, AWS SageMaker, GCP, Azure</w:t>
       </w:r>
     </w:p>
     <w:p>
@@ -421,14 +317,14 @@
           <w:b/>
           <w:color w:val="1F4E79"/>
         </w:rPr>
-        <w:t xml:space="preserve">Vector Databases: </w:t>
+        <w:t xml:space="preserve">Vector Search &amp; Embeddings: </w:t>
       </w:r>
       <w:r>
         <w:rPr>
           <w:b w:val="0"/>
           <w:color w:val="000000"/>
         </w:rPr>
-        <w:t>PostgreSQL (pgvector), Elasticsearch, Qdrant, Milvus</w:t>
+        <w:t>Embeddings, BM25, MMR, Cross-Encoder Reranking, RRF, Ragas</w:t>
       </w:r>
     </w:p>
     <w:p>
@@ -442,14 +338,14 @@
           <w:b/>
           <w:color w:val="1F4E79"/>
         </w:rPr>
-        <w:t xml:space="preserve">Document Intelligence: </w:t>
+        <w:t xml:space="preserve">AI Model &amp; API Integration: </w:t>
       </w:r>
       <w:r>
         <w:rPr>
           <w:b w:val="0"/>
           <w:color w:val="000000"/>
         </w:rPr>
-        <w:t>Document Parsing, OCR, Unstructured Data Processing</w:t>
+        <w:t>FastAPI, OpenAI-compatible APIs, vLLM, llama.cpp</w:t>
       </w:r>
     </w:p>
     <w:p>
@@ -463,14 +359,14 @@
           <w:b/>
           <w:color w:val="1F4E79"/>
         </w:rPr>
-        <w:t xml:space="preserve">LLM Inference &amp; Deployment: </w:t>
+        <w:t xml:space="preserve">Machine Learning: </w:t>
       </w:r>
       <w:r>
         <w:rPr>
           <w:b w:val="0"/>
           <w:color w:val="000000"/>
         </w:rPr>
-        <w:t>vLLM, llama.cpp, FastAPI, OpenAI-compatible APIs</w:t>
+        <w:t>Scikit-learn, TensorFlow, PyTorch</w:t>
       </w:r>
     </w:p>
     <w:p>
@@ -484,14 +380,14 @@
           <w:b/>
           <w:color w:val="1F4E79"/>
         </w:rPr>
-        <w:t xml:space="preserve">RAG &amp; Vector Search: </w:t>
+        <w:t xml:space="preserve">Data Visualization: </w:t>
       </w:r>
       <w:r>
         <w:rPr>
           <w:b w:val="0"/>
           <w:color w:val="000000"/>
         </w:rPr>
-        <w:t>Hybrid/Semantic Search, Embeddings, BM25, MMR, Cross-Encoder Reranking, RRF, Ragas</w:t>
+        <w:t>Matplotlib, Seaborn, Power BI, Looker Studio, Excel</w:t>
       </w:r>
     </w:p>
     <w:p>
@@ -645,69 +541,68 @@
       <w:r>
         <w:rPr>
           <w:rFonts w:eastAsia="Calibri" w:cs="Calibri" w:ascii="Calibri" w:hAnsi="Calibri"/>
-          <w:color w:val="444444"/>
-          <w:sz w:val="20"/>
-          <w:szCs w:val="20"/>
-        </w:rPr>
-        <w:t xml:space="preserve">[Action verb] a Retrieval-Augmented Generation (RAG) system to solve [problem/business need], </w:t>
-      </w:r>
-    </w:p>
-    <w:p>
-      <w:pPr>
-        <w:pStyle w:val="ListParagraph"/>
-        <w:widowControl/>
-        <w:numPr>
-          <w:ilvl w:val="0"/>
-          <w:numId w:val="0"/>
-        </w:numPr>
-        <w:bidi w:val="0"/>
-        <w:spacing w:before="0" w:after="60"/>
-        <w:ind w:hanging="0" w:start="720" w:end="0"/>
-        <w:jc w:val="start"/>
-        <w:rPr>
-          <w:rFonts w:ascii="Calibri" w:hAnsi="Calibri" w:eastAsia="Calibri" w:cs="Calibri"/>
-          <w:color w:val="444444"/>
-          <w:sz w:val="20"/>
-          <w:szCs w:val="20"/>
-        </w:rPr>
-      </w:pPr>
-      <w:r>
-        <w:rPr>
-          <w:rFonts w:eastAsia="Calibri" w:cs="Calibri" w:ascii="Calibri" w:hAnsi="Calibri"/>
-          <w:color w:val="444444"/>
-          <w:sz w:val="20"/>
-          <w:szCs w:val="20"/>
-        </w:rPr>
-        <w:t xml:space="preserve">by [technical approach/architecture — e.g. vector DB, embedding model, LLM]. </w:t>
-      </w:r>
-    </w:p>
-    <w:p>
-      <w:pPr>
-        <w:pStyle w:val="ListParagraph"/>
-        <w:widowControl/>
-        <w:numPr>
-          <w:ilvl w:val="0"/>
-          <w:numId w:val="0"/>
-        </w:numPr>
-        <w:bidi w:val="0"/>
-        <w:spacing w:before="0" w:after="60"/>
-        <w:ind w:hanging="0" w:start="720" w:end="0"/>
-        <w:jc w:val="start"/>
-        <w:rPr>
-          <w:rFonts w:ascii="Calibri" w:hAnsi="Calibri" w:eastAsia="Calibri" w:cs="Calibri"/>
-          <w:color w:val="444444"/>
-          <w:sz w:val="20"/>
-          <w:szCs w:val="20"/>
-        </w:rPr>
-      </w:pPr>
-      <w:r>
-        <w:rPr>
-          <w:rFonts w:eastAsia="Calibri" w:cs="Calibri" w:ascii="Calibri" w:hAnsi="Calibri"/>
-          <w:color w:val="444444"/>
-          <w:sz w:val="20"/>
-          <w:szCs w:val="20"/>
-        </w:rPr>
-        <w:t>Deployed on [cloud platform] using [method/framework], achieving [quantifiable result].</w:t>
+          <w:b/>
+          <w:color w:val="444444"/>
+          <w:sz w:val="20"/>
+          <w:szCs w:val="20"/>
+        </w:rPr>
+        <w:t>Built</w:t>
+      </w:r>
+      <w:r>
+        <w:rPr>
+          <w:rFonts w:ascii="Calibri" w:hAnsi="Calibri"/>
+          <w:b w:val="0"/>
+          <w:sz w:val="20"/>
+        </w:rPr>
+        <w:t xml:space="preserve"> a Retrieval-Augmented Generation (RAG) system to solve </w:t>
+      </w:r>
+      <w:r>
+        <w:rPr>
+          <w:rFonts w:ascii="Calibri" w:hAnsi="Calibri"/>
+          <w:b/>
+          <w:sz w:val="20"/>
+        </w:rPr>
+        <w:t>extracting knowledge from .pdf, .excel, .ppt and diagrams in enterprise documents</w:t>
+      </w:r>
+      <w:r>
+        <w:rPr>
+          <w:rFonts w:ascii="Calibri" w:hAnsi="Calibri"/>
+          <w:b w:val="0"/>
+          <w:sz w:val="20"/>
+        </w:rPr>
+        <w:t xml:space="preserve">, by </w:t>
+      </w:r>
+      <w:r>
+        <w:rPr>
+          <w:rFonts w:ascii="Calibri" w:hAnsi="Calibri"/>
+          <w:b/>
+          <w:sz w:val="20"/>
+        </w:rPr>
+        <w:t>PostgreSQL (pgvector) with OpenAI-compatible LLMs</w:t>
+      </w:r>
+      <w:r>
+        <w:rPr>
+          <w:rFonts w:ascii="Calibri" w:hAnsi="Calibri"/>
+          <w:b w:val="0"/>
+          <w:sz w:val="20"/>
+        </w:rPr>
+        <w:t xml:space="preserve">. Deployed on  using , achieving </w:t>
+      </w:r>
+      <w:r>
+        <w:rPr>
+          <w:rFonts w:ascii="Calibri" w:hAnsi="Calibri"/>
+          <w:b/>
+          <w:sz w:val="20"/>
+        </w:rPr>
+        <w:t>hybrid-retrieval RAG application</w:t>
+      </w:r>
+      <w:r>
+        <w:rPr>
+          <w:rFonts w:ascii="Calibri" w:hAnsi="Calibri"/>
+          <w:b w:val="0"/>
+          <w:sz w:val="20"/>
+        </w:rPr>
+        <w:t>..</w:t>
       </w:r>
     </w:p>
     <w:p>
@@ -1879,8 +1774,8 @@
       <w:u w:val="single"/>
     </w:rPr>
   </w:style>
-  <w:style w:type="character" w:styleId="FootnoteCharacters">
-    <w:name w:val="Footnote Characters"/>
+  <w:style w:type="character" w:styleId="FootnoteCharactersuser">
+    <w:name w:val="Footnote Characters (user)"/>
     <w:uiPriority w:val="99"/>
     <w:semiHidden/>
     <w:unhideWhenUsed/>
@@ -1889,8 +1784,8 @@
       <w:vertAlign w:val="superscript"/>
     </w:rPr>
   </w:style>
-  <w:style w:type="character" w:styleId="FootnoteCharactersuser">
-    <w:name w:val="Footnote Characters (user)"/>
+  <w:style w:type="character" w:styleId="FootnoteCharacters">
+    <w:name w:val="Footnote Characters"/>
     <w:qFormat/>
     <w:rPr>
       <w:vertAlign w:val="superscript"/>
@@ -1914,8 +1809,8 @@
       <w:szCs w:val="20"/>
     </w:rPr>
   </w:style>
-  <w:style w:type="character" w:styleId="EndnoteCharacters">
-    <w:name w:val="Endnote Characters"/>
+  <w:style w:type="character" w:styleId="EndnoteCharactersuser">
+    <w:name w:val="Endnote Characters (user)"/>
     <w:uiPriority w:val="99"/>
     <w:semiHidden/>
     <w:unhideWhenUsed/>
@@ -1924,8 +1819,8 @@
       <w:vertAlign w:val="superscript"/>
     </w:rPr>
   </w:style>
-  <w:style w:type="character" w:styleId="EndnoteCharactersuser">
-    <w:name w:val="Endnote Characters (user)"/>
+  <w:style w:type="character" w:styleId="EndnoteCharacters">
+    <w:name w:val="Endnote Characters"/>
     <w:qFormat/>
     <w:rPr>
       <w:vertAlign w:val="superscript"/>
@@ -1964,8 +1859,8 @@
       <w:u w:val="single"/>
     </w:rPr>
   </w:style>
-  <w:style w:type="character" w:styleId="Bullets">
-    <w:name w:val="Bullets"/>
+  <w:style w:type="character" w:styleId="Bulletsuser">
+    <w:name w:val="Bullets (user)"/>
     <w:qFormat/>
     <w:rPr>
       <w:rFonts w:ascii="OpenSymbol" w:hAnsi="OpenSymbol" w:eastAsia="OpenSymbol" w:cs="OpenSymbol"/>

</xml_diff>

<commit_message>
feat: add ChatGPT-style chat history to Streamlit UI
- Persist user inputs and assistant outputs in st.session_state
- Render conversation using st.chat_message for user/assistant bubbles
- Keep each turn's streamed events and final state separate instead of overwriting
- Add optional clear chat button to reset session state
</commit_message>
<xml_diff>
--- a/resumes/resume.docx
+++ b/resumes/resume.docx
@@ -156,20 +156,28 @@
         <w:rPr>
           <w:rStyle w:val="Strong"/>
           <w:rFonts w:eastAsia="Calibri" w:cs="Calibri" w:ascii="Calibri" w:hAnsi="Calibri"/>
-          <w:b/>
-          <w:color w:val="444444"/>
-          <w:sz w:val="20"/>
-          <w:szCs w:val="20"/>
-        </w:rPr>
-        <w:t>AI/ML Engineer with 3+ years of experience</w:t>
-      </w:r>
-      <w:r>
-        <w:rPr>
-          <w:rFonts w:eastAsia="Calibri" w:cs="Calibri" w:ascii="Calibri" w:hAnsi="Calibri"/>
-          <w:color w:val="444444"/>
-          <w:sz w:val="20"/>
-          <w:szCs w:val="20"/>
-        </w:rPr>
+          <w:b w:val="0"/>
+          <w:color w:val="444444"/>
+          <w:sz w:val="20"/>
+          <w:szCs w:val="20"/>
+        </w:rPr>
+        <w:t xml:space="preserve">AI/ML Engineer with 3+ years of experience designing and deploying Generative AI solutions, specializing in RAG architectures, LLMs, and Python-based systems. Expert in building hybrid RAG pipelines using PostgreSQL (pgvector) and OpenAI-compatible models, with hands-on experience in prompt engineering, LangChain, and FastAPI. Skilled in MLOps, Docker, and CI/CD, and proficient in vector databases like FAISS and cloud platforms (AWS, Azure). Currently pursuing an </w:t>
+      </w:r>
+      <w:r>
+        <w:rPr>
+          <w:rFonts w:eastAsia="Calibri" w:cs="Calibri" w:ascii="Calibri" w:hAnsi="Calibri"/>
+          <w:color w:val="444444"/>
+          <w:sz w:val="20"/>
+          <w:szCs w:val="20"/>
+        </w:rPr>
+      </w:r>
+      <w:r>
+        <w:rPr>
+          <w:rFonts w:ascii="Calibri" w:hAnsi="Calibri"/>
+          <w:b/>
+          <w:sz w:val="20"/>
+        </w:rPr>
+        <w:t>MBA in AI &amp; ML</w:t>
       </w:r>
       <w:r>
         <w:rPr>
@@ -177,39 +185,7 @@
           <w:b w:val="0"/>
           <w:sz w:val="20"/>
         </w:rPr>
-        <w:t xml:space="preserve"> building and deploying production-grade Machine Learning, Generative AI, and Python-based solutions across the full ML lifecycle—from ETL and feature engineering to model training, LLM applications, multimodal RAG, MLOps, deployment, and monitoring. Skilled in Python, FastAPI, PostgreSQL (pgvector), LangChain, and cloud-ready AI systems. Currently completing an MBA in Artificial Intelligence &amp; Machine Learning, combining strong technical expertise with business strategy. </w:t>
-      </w:r>
-      <w:r>
-        <w:rPr>
-          <w:rFonts w:ascii="Calibri" w:hAnsi="Calibri"/>
-          <w:b/>
-          <w:sz w:val="20"/>
-        </w:rPr>
-        <w:t>Expert in RAG pipelines, embeddings, vector databases, and prompt engineering</w:t>
-      </w:r>
-      <w:r>
-        <w:rPr>
-          <w:rFonts w:ascii="Calibri" w:hAnsi="Calibri"/>
-          <w:b w:val="0"/>
-          <w:sz w:val="20"/>
-        </w:rPr>
-        <w:t xml:space="preserve">, with experience in AWS/Azure/GCP, Docker, CI/CD, and model evaluation. </w:t>
-      </w:r>
-      <w:r>
-        <w:rPr>
-          <w:rFonts w:ascii="Calibri" w:hAnsi="Calibri"/>
-          <w:b/>
-          <w:sz w:val="20"/>
-        </w:rPr>
-        <w:t>Proven track record in developing scalable AI components and automating experimentation workflows</w:t>
-      </w:r>
-      <w:r>
-        <w:rPr>
-          <w:rFonts w:ascii="Calibri" w:hAnsi="Calibri"/>
-          <w:b w:val="0"/>
-          <w:sz w:val="20"/>
-        </w:rPr>
-        <w:t>.</w:t>
+        <w:t>, combining technical expertise with business strategy to drive AI innovation in enterprise applications.</w:t>
       </w:r>
     </w:p>
     <w:p>
@@ -261,7 +237,7 @@
           <w:b w:val="0"/>
           <w:color w:val="000000"/>
         </w:rPr>
-        <w:t>LLMs, RAG, LangChain, LangGraph, Prompt Engineering</w:t>
+        <w:t>LLMs, RAG, LangChain, LangGraph, Prompt Engineering, Fine-Tuning</w:t>
       </w:r>
     </w:p>
     <w:p>
@@ -317,14 +293,14 @@
           <w:b/>
           <w:color w:val="1F4E79"/>
         </w:rPr>
-        <w:t xml:space="preserve">Vector Search &amp; Embeddings: </w:t>
+        <w:t xml:space="preserve">RAG &amp; Vector Search: </w:t>
       </w:r>
       <w:r>
         <w:rPr>
           <w:b w:val="0"/>
           <w:color w:val="000000"/>
         </w:rPr>
-        <w:t>Embeddings, BM25, MMR, Cross-Encoder Reranking, RRF, Ragas</w:t>
+        <w:t>PostgreSQL (pgvector), Hybrid/Semantic Search, Embeddings, BM25, MMR, Cross-Encoder Reranking, RRF, Ragas</w:t>
       </w:r>
     </w:p>
     <w:p>
@@ -338,14 +314,14 @@
           <w:b/>
           <w:color w:val="1F4E79"/>
         </w:rPr>
-        <w:t xml:space="preserve">AI Model &amp; API Integration: </w:t>
+        <w:t xml:space="preserve">LLM Providers: </w:t>
       </w:r>
       <w:r>
         <w:rPr>
           <w:b w:val="0"/>
           <w:color w:val="000000"/>
         </w:rPr>
-        <w:t>FastAPI, OpenAI-compatible APIs, vLLM, llama.cpp</w:t>
+        <w:t>OpenAI, Anthropic (Claude), Azure OpenAI, OpenRouter, xAI (Grok)</w:t>
       </w:r>
     </w:p>
     <w:p>
@@ -359,14 +335,14 @@
           <w:b/>
           <w:color w:val="1F4E79"/>
         </w:rPr>
-        <w:t xml:space="preserve">Machine Learning: </w:t>
+        <w:t xml:space="preserve">LLM Inference &amp; Deployment: </w:t>
       </w:r>
       <w:r>
         <w:rPr>
           <w:b w:val="0"/>
           <w:color w:val="000000"/>
         </w:rPr>
-        <w:t>Scikit-learn, TensorFlow, PyTorch</w:t>
+        <w:t>vLLM, llama.cpp, FastAPI, OpenAI-compatible APIs</w:t>
       </w:r>
     </w:p>
     <w:p>
@@ -380,7 +356,7 @@
           <w:b/>
           <w:color w:val="1F4E79"/>
         </w:rPr>
-        <w:t xml:space="preserve">Data Visualization: </w:t>
+        <w:t xml:space="preserve">Visualization: </w:t>
       </w:r>
       <w:r>
         <w:rPr>
@@ -1184,19 +1160,16 @@
           <w:b/>
           <w:bCs/>
           <w:color w:val="1F3864"/>
-          <w:sz w:val="20"/>
-          <w:szCs w:val="20"/>
-        </w:rPr>
-        <w:t>B.Sc. Mathematics &amp; Computer Science</w:t>
-      </w:r>
-      <w:r>
-        <w:rPr>
-          <w:rFonts w:eastAsia="Calibri" w:cs="Calibri" w:ascii="Calibri" w:hAnsi="Calibri"/>
-          <w:color w:val="444444"/>
-          <w:sz w:val="19"/>
-          <w:szCs w:val="19"/>
-        </w:rPr>
-        <w:t xml:space="preserve">  |  University of Delhi  |  2019 – 2022</w:t>
+          <w:kern w:val="0"/>
+          <w:sz w:val="20"/>
+          <w:szCs w:val="20"/>
+          <w:lang w:val="en-US" w:eastAsia="zh-CN" w:bidi="hi-IN"/>
+        </w:rPr>
+        <w:t xml:space="preserve">Bachelor’s Mathematics &amp; Computer Science </w:t>
+      </w:r>
+      <w:r>
+        <w:rPr/>
+        <w:t xml:space="preserve"> |  University of Delhi  |  2019 – 2022</w:t>
       </w:r>
     </w:p>
     <w:p>

</xml_diff>